<commit_message>
Lab 7: History capture, reached-buildings step, re-pilot fixes
A GUI session ran Flood Loop from its tool dialog and the Step 7 tools, and
the Geoprocessing History pane with the Flood Loop card open is now Figure 7
on the page, where the deliverables and rubric point at it.

The re-pilot of the cut page reproduced all 38 check values and found that
Map 2's highlighted buildings had no step producing them: Step 7 now ends
with Select Layer By Location and Export Features to Mine_Reached. Smaller
fixes from the same pilot: River_Cells and the HAND range named in the
deliverables, how to open a model's dialog for its capture, the H_CM = 153
selection, Comparison_Area described as where the Step 6 agreement was
measured, Stage_Table's extra fields named, the "introduced Tuesday" wording
dropped, and two speaker notes in the Thursday deck brought in line.

Template rebuilt to match; example maps renumbered to Figures 8 and 9.

Co-Authored-By: Claude Fable 5.1 <noreply@anthropic.com>
</commit_message>
<xml_diff>
--- a/docs/assignments/lab-07/lab07-report-template.docx
+++ b/docs/assignments/lab-07/lab07-report-template.docx
@@ -2504,7 +2504,7 @@
           <w:sz w:val="19"/>
           <w:szCs w:val="19"/>
         </w:rPr>
-        <w:t xml:space="preserve">Rubric: the Floods_Buildings table captured, and the five areas and building counts in a table with their return periods and flows, matching the check values (3 points); the areas also show the models work (part of their 4 points). Type your own numbers from your own attribute table.</w:t>
+        <w:t xml:space="preserve">Rubric: the Floods_Buildings table captured, and the five areas and building counts in a table with their return periods and flows, matching the check values (3 points); the areas, River_Cells and the HAND range also show the models work (part of their 4 points). Type your own numbers from your own attribute tables.</w:t>
       </w:r>
     </w:p>
     <w:p>
@@ -3714,7 +3714,7 @@
                 <w:sz w:val="19"/>
                 <w:szCs w:val="19"/>
               </w:rPr>
-              <w:t xml:space="preserve">Area of flood_mine (km², from Shape_Area)</w:t>
+              <w:t xml:space="preserve">Area of floodpoly_mine (km², from its Shape_Area)</w:t>
             </w:r>
           </w:p>
         </w:tc>
@@ -3762,7 +3762,7 @@
                 <w:sz w:val="19"/>
                 <w:szCs w:val="19"/>
               </w:rPr>
-              <w:t xml:space="preserve">Buildings reached (Join_Count)</w:t>
+              <w:t xml:space="preserve">Buildings reached (Join_Count in Mine_Buildings; the Count of Select Layer By Location)</w:t>
             </w:r>
           </w:p>
         </w:tc>
@@ -3882,7 +3882,7 @@
           <w:sz w:val="19"/>
           <w:szCs w:val="19"/>
         </w:rPr>
-        <w:t xml:space="preserve">Rubric: a screen capture of the Geoprocessing History pane (Analysis tab ▸ History) with the Flood Loop run and the three Step 7 tools expanded so their parameters and run times show (3 points).</w:t>
+        <w:t xml:space="preserve">Rubric: a screen capture of the Geoprocessing History pane (Analysis tab ▸ History) listing the Flood Loop run and the Step 7 tools, with the Flood Loop card open so its times and parameters show (3 points). See the lab page’s Figure 7.</w:t>
       </w:r>
     </w:p>
     <w:tbl>
@@ -3943,7 +3943,7 @@
           <w:sz w:val="19"/>
           <w:szCs w:val="19"/>
         </w:rPr>
-        <w:t xml:space="preserve">Figure 4. Geoprocessing History, showing the Flood Loop run and the three tools of Step 7.</w:t>
+        <w:t xml:space="preserve">Figure 4. Geoprocessing History, listing the Flood Loop run and the Step 7 tools, with the Flood Loop card open.</w:t>
       </w:r>
     </w:p>
     <w:p>
@@ -4868,7 +4868,7 @@
                 <w:sz w:val="17"/>
                 <w:szCs w:val="17"/>
               </w:rPr>
-              <w:t xml:space="preserve">The Geoprocessing History capture showing the Flood Loop run and the three Step 7 tools, with their parameters (3)</w:t>
+              <w:t xml:space="preserve">The Geoprocessing History capture listing the Flood Loop run and the Step 7 tools, with the Flood Loop card open (3)</w:t>
             </w:r>
           </w:p>
         </w:tc>

</xml_diff>

<commit_message>
Lab 7: second pilot of the cut page, five small fixes
A second no-GUI pilot of the page as it stands after b3e1f87 reproduced
44 of 46 numbers to the digit; the two others are Figure B's
sampling-dependent widths, now written as "about". Fixes: the one-week
note counts five Step 7 tools, not three; the template's HAND Against
FEMA section gets a prose prompt so the scored sentences are not skipped;
the stage table explains why the 500-year row reads 1.733 m rather than
1.734; the peer-review box asks for the stamp the template asks for;
Figure 7's caption explains the C:\ paths.

Co-Authored-By: Claude Fable 5.1 <noreply@anthropic.com>
</commit_message>
<xml_diff>
--- a/docs/assignments/lab-07/lab07-report-template.docx
+++ b/docs/assignments/lab-07/lab07-report-template.docx
@@ -3980,6 +3980,20 @@
           <w:szCs w:val="19"/>
         </w:rPr>
         <w:t xml:space="preserve">Rubric: one or two sentences on what the hit rate (0.548), false-alarm ratio (0.425) and CSI (0.390) say about the two maps, and one place where HAND and FEMA disagree, with coordinates, a cropped figure and the reason (3 points). A general paragraph about HAND earns nothing here; name the place.</w:t>
+      </w:r>
+    </w:p>
+    <w:p>
+      <w:pPr>
+        <w:spacing w:after="260" w:before="0"/>
+      </w:pPr>
+      <w:r>
+        <w:rPr>
+          <w:i/>
+          <w:iCs/>
+          <w:color w:val="767171"/>
+          <w:highlight w:val="yellow"/>
+        </w:rPr>
+        <w:t xml:space="preserve">[Add your content here.]</w:t>
       </w:r>
     </w:p>
     <w:p>

</xml_diff>

<commit_message>
Lab 7 Map 2: allow the gage in a locator inset
A student asked before the deadline whether Map 2 could leave out the gage
when the main frame is zoomed to the flooded buildings. The deliverable and
rubric now accept the gage in the main frame or in a locator inset that
outlines the main frame's extent. The Figure 9 caption notes that buildings
next to the gage flood at every design flow, so a frame holding both is
possible. Template hint updated and template regenerated.

Co-Authored-By: Claude Opus 5.5 <noreply@anthropic.com>
</commit_message>
<xml_diff>
--- a/docs/assignments/lab-07/lab07-report-template.docx
+++ b/docs/assignments/lab-07/lab07-report-template.docx
@@ -4201,7 +4201,7 @@
           <w:sz w:val="19"/>
           <w:szCs w:val="19"/>
         </w:rPr>
-        <w:t xml:space="preserve">Must carry: a title stating your flow and h; neat line, north arrow and scale bar; the same text box items as Map 1; your flood with a legend, the river and the gage; the buildings it reaches highlighted with their count on the map; the main frame zoomed to where the flood reaches buildings (an inset alone does not count).</w:t>
+        <w:t xml:space="preserve">Must carry: a title stating your flow and h; neat line, north arrow and scale bar; the same text box items as Map 1; your flood with a legend and the river; the gage, in the main frame or in a locator inset that outlines the main frame’s extent; the buildings it reaches highlighted with their count on the map; the main frame zoomed to where the flood reaches buildings (an inset alone does not count).</w:t>
       </w:r>
     </w:p>
     <w:tbl>
@@ -5214,7 +5214,7 @@
                 <w:sz w:val="17"/>
                 <w:szCs w:val="17"/>
               </w:rPr>
-              <w:t xml:space="preserve">Your flood symbolized with a legend, the river and the gage shown (2)</w:t>
+              <w:t xml:space="preserve">Your flood symbolized with a legend, the river shown, and the gage shown in the main frame or a locator inset (2)</w:t>
             </w:r>
           </w:p>
           <w:p>

</xml_diff>